<commit_message>
docs(test): regenerate test documents + verify test accounts
</commit_message>
<xml_diff>
--- a/23CT113_Nhom02_NenTangCrowdfunding(TuTeFund)/TimeLine/Biên Bản Họp Nhóm Lần 1 – Báo Cáo Cuối Kỳ Môn Kiểm Thử Phần Mềm.docx
+++ b/23CT113_Nhom02_NenTangCrowdfunding(TuTeFund)/TimeLine/Biên Bản Họp Nhóm Lần 1 – Báo Cáo Cuối Kỳ Môn Kiểm Thử Phần Mềm.docx
@@ -133,11 +133,7 @@
     </w:p>
     <w:p>
       <w:r>
-        <w:rPr>
-          <w:rFonts w:ascii="Times New Roman" w:hAnsi="Times New Roman"/>
-          <w:sz w:val="22"/>
-        </w:rPr>
-        <w:t>• Phân chia 10 phân hệ nghiệp vụ cho 5 thành viên (mỗi người phụ trách 2 phân hệ: 16 TR &amp; 40 TC)</w:t>
+        <w:t>• Phân chia 10 phân hệ nghiệp vụ cho 5 thành viên (tổng cộng 42 TR &amp; 105 TC)</w:t>
       </w:r>
     </w:p>
     <w:p>
@@ -173,11 +169,7 @@
     </w:p>
     <w:p>
       <w:r>
-        <w:rPr>
-          <w:rFonts w:ascii="Times New Roman" w:hAnsi="Times New Roman"/>
-          <w:sz w:val="22"/>
-        </w:rPr>
-        <w:t>- Thành viên thảo luận về phạm vi: 10 phân hệ bao gồm AUTH, DONATE, CAMP, DISBURSE, USER, ADMIN, BLOG, CHAT, STATS, SYSTEM</w:t>
+        <w:t>- Thành viên thảo luận về phạm vi: 10 phân hệ gồm AUTH, KYC, CAMP, REWARD, PLEDGE, CERT, COMM, BLOG, CHAT, ADMIN</w:t>
       </w:r>
     </w:p>
     <w:p>
@@ -204,47 +196,27 @@
     </w:p>
     <w:p>
       <w:r>
-        <w:rPr>
-          <w:rFonts w:ascii="Times New Roman" w:hAnsi="Times New Roman"/>
-          <w:sz w:val="22"/>
-        </w:rPr>
-        <w:t>✔ Nguyễn Quách Phú Tài: Phụ trách AUTH &amp; DONATE (TR-001 -&gt; TR-016, 40 TC), review cho Trần Xuân Ân</w:t>
-      </w:r>
-    </w:p>
-    <w:p>
-      <w:r>
-        <w:rPr>
-          <w:rFonts w:ascii="Times New Roman" w:hAnsi="Times New Roman"/>
-          <w:sz w:val="22"/>
-        </w:rPr>
-        <w:t>✔ Trần Xuân Ân: Phụ trách CAMP &amp; DISBURSE (TR-017 -&gt; TR-032, 40 TC), review cho Bùi Đặng Quốc Khánh</w:t>
-      </w:r>
-    </w:p>
-    <w:p>
-      <w:r>
-        <w:rPr>
-          <w:rFonts w:ascii="Times New Roman" w:hAnsi="Times New Roman"/>
-          <w:sz w:val="22"/>
-        </w:rPr>
-        <w:t>✔ Bùi Đặng Quốc Khánh: Phụ trách USER &amp; ADMIN (TR-033 -&gt; TR-048, 40 TC), review cho Nguyễn Trung Tiến</w:t>
-      </w:r>
-    </w:p>
-    <w:p>
-      <w:r>
-        <w:rPr>
-          <w:rFonts w:ascii="Times New Roman" w:hAnsi="Times New Roman"/>
-          <w:sz w:val="22"/>
-        </w:rPr>
-        <w:t>✔ Nguyễn Trung Tiến: Phụ trách BLOG &amp; CHAT (TR-049 -&gt; TR-064, 40 TC), review cho Nguyễn Khánh Du</w:t>
-      </w:r>
-    </w:p>
-    <w:p>
-      <w:r>
-        <w:rPr>
-          <w:rFonts w:ascii="Times New Roman" w:hAnsi="Times New Roman"/>
-          <w:sz w:val="22"/>
-        </w:rPr>
-        <w:t>✔ Nguyễn Khánh Du: Phụ trách STATS &amp; SYSTEM (TR-065 -&gt; TR-080, 40 TC), review cho Nguyễn Quách Phú Tài</w:t>
+        <w:t>✔ Nguyễn Quách Phú Tài: Phụ trách AUTH &amp; KYC (TR-001 -&gt; TR-009, 23 TC), review cho Trần Xuân Ân</w:t>
+      </w:r>
+    </w:p>
+    <w:p>
+      <w:r>
+        <w:t>✔ Trần Xuân Ân: Phụ trách CAMP &amp; REWARD (TR-010 -&gt; TR-018, 24 TC), review cho Bùi Đặng Quốc Khánh</w:t>
+      </w:r>
+    </w:p>
+    <w:p>
+      <w:r>
+        <w:t>✔ Bùi Đặng Quốc Khánh: Phụ trách PLEDGE &amp; CERT (TR-019 -&gt; TR-027, 20 TC), review cho Nguyễn Trung Tiến</w:t>
+      </w:r>
+    </w:p>
+    <w:p>
+      <w:r>
+        <w:t>✔ Nguyễn Trung Tiến: Phụ trách COMM &amp; BLOG (TR-028 -&gt; TR-035, 23 TC), review cho Nguyễn Khánh Du</w:t>
+      </w:r>
+    </w:p>
+    <w:p>
+      <w:r>
+        <w:t>✔ Nguyễn Khánh Du: Phụ trách CHAT &amp; ADMIN (TR-036 -&gt; TR-042, 15 TC), review cho Nguyễn Quách Phú Tài</w:t>
       </w:r>
     </w:p>
     <w:p>
@@ -284,6 +256,105 @@
           <w:sz w:val="22"/>
         </w:rPr>
         <w:t>Bùi Đặng Quốc Khánh                                                                    Nguyễn Quách Phú Tài</w:t>
+      </w:r>
+    </w:p>
+    <w:p>
+      <w:r>
+        <w:t>5. HÌNH ẢNH MINH CHỨNG PHIÊN HỌP</w:t>
+      </w:r>
+    </w:p>
+    <w:p>
+      <w:pPr>
+        <w:jc w:val="center"/>
+      </w:pPr>
+      <w:r>
+        <w:drawing>
+          <wp:inline xmlns:wp="http://schemas.openxmlformats.org/drawingml/2006/wordprocessingDrawing" xmlns:a="http://schemas.openxmlformats.org/drawingml/2006/main" xmlns:pic="http://schemas.openxmlformats.org/drawingml/2006/picture" xmlns:r="http://schemas.openxmlformats.org/officeDocument/2006/relationships">
+            <wp:extent cx="5029200" cy="3143250"/>
+            <wp:docPr id="1" name="Picture 1"/>
+            <wp:cNvGraphicFramePr>
+              <a:graphicFrameLocks noChangeAspect="1"/>
+            </wp:cNvGraphicFramePr>
+            <a:graphic>
+              <a:graphicData uri="http://schemas.openxmlformats.org/drawingml/2006/picture">
+                <pic:pic>
+                  <pic:nvPicPr>
+                    <pic:cNvPr id="0" name="meeting1_img.jpg"/>
+                    <pic:cNvPicPr/>
+                  </pic:nvPicPr>
+                  <pic:blipFill>
+                    <a:blip r:embed="rId1"/>
+                    <a:stretch>
+                      <a:fillRect/>
+                    </a:stretch>
+                  </pic:blipFill>
+                  <pic:spPr>
+                    <a:xfrm>
+                      <a:off x="0" y="0"/>
+                      <a:ext cx="5029200" cy="3143250"/>
+                    </a:xfrm>
+                    <a:prstGeom prst="rect"/>
+                  </pic:spPr>
+                </pic:pic>
+              </a:graphicData>
+            </a:graphic>
+          </wp:inline>
+        </w:drawing>
+      </w:r>
+    </w:p>
+    <w:p>
+      <w:pPr>
+        <w:jc w:val="center"/>
+      </w:pPr>
+      <w:r>
+        <w:t>Hình 1. Phiên họp nhóm lần 1 – ngày 18/10/2026</w:t>
+      </w:r>
+    </w:p>
+    <w:p>
+      <w:pPr>
+        <w:jc w:val="center"/>
+      </w:pPr>
+      <w:r>
+        <w:drawing>
+          <wp:inline xmlns:wp="http://schemas.openxmlformats.org/drawingml/2006/wordprocessingDrawing" xmlns:a="http://schemas.openxmlformats.org/drawingml/2006/main" xmlns:pic="http://schemas.openxmlformats.org/drawingml/2006/picture" xmlns:r="http://schemas.openxmlformats.org/officeDocument/2006/relationships">
+            <wp:extent cx="5029200" cy="3143250"/>
+            <wp:docPr id="2" name="Picture 2"/>
+            <wp:cNvGraphicFramePr>
+              <a:graphicFrameLocks noChangeAspect="1"/>
+            </wp:cNvGraphicFramePr>
+            <a:graphic>
+              <a:graphicData uri="http://schemas.openxmlformats.org/drawingml/2006/picture">
+                <pic:pic>
+                  <pic:nvPicPr>
+                    <pic:cNvPr id="0" name="image.jpg"/>
+                    <pic:cNvPicPr/>
+                  </pic:nvPicPr>
+                  <pic:blipFill>
+                    <a:blip r:embed="rId1"/>
+                    <a:stretch>
+                      <a:fillRect/>
+                    </a:stretch>
+                  </pic:blipFill>
+                  <pic:spPr>
+                    <a:xfrm>
+                      <a:off x="0" y="0"/>
+                      <a:ext cx="5029200" cy="3143250"/>
+                    </a:xfrm>
+                    <a:prstGeom prst="rect"/>
+                  </pic:spPr>
+                </pic:pic>
+              </a:graphicData>
+            </a:graphic>
+          </wp:inline>
+        </w:drawing>
+      </w:r>
+    </w:p>
+    <w:p>
+      <w:pPr>
+        <w:jc w:val="center"/>
+      </w:pPr>
+      <w:r>
+        <w:t>Hình 1. Phiên họp nhóm lần 1 – ngày 18/10/2026</w:t>
       </w:r>
     </w:p>
   </w:body>

</xml_diff>